<commit_message>
feat: enhance NSS report generation with event type extraction and improved photo handling
</commit_message>
<xml_diff>
--- a/lib/reports/templates/nss-report.docx
+++ b/lib/reports/templates/nss-report.docx
@@ -216,7 +216,37 @@
                 <w:sz w:val="32"/>
                 <w:szCs w:val="32"/>
               </w:rPr>
-              <w:t>Activities 2024-25</w:t>
+              <w:t>Activities 202</w:t>
+            </w:r>
+            <w:r>
+              <w:rPr>
+                <w:rFonts w:ascii="Arial" w:eastAsia="Arial" w:hAnsi="Arial" w:cs="Arial"/>
+                <w:b/>
+                <w:i/>
+                <w:sz w:val="32"/>
+                <w:szCs w:val="32"/>
+              </w:rPr>
+              <w:t>5</w:t>
+            </w:r>
+            <w:r>
+              <w:rPr>
+                <w:rFonts w:ascii="Arial" w:eastAsia="Arial" w:hAnsi="Arial" w:cs="Arial"/>
+                <w:b/>
+                <w:i/>
+                <w:sz w:val="32"/>
+                <w:szCs w:val="32"/>
+              </w:rPr>
+              <w:t>-2</w:t>
+            </w:r>
+            <w:r>
+              <w:rPr>
+                <w:rFonts w:ascii="Arial" w:eastAsia="Arial" w:hAnsi="Arial" w:cs="Arial"/>
+                <w:b/>
+                <w:i/>
+                <w:sz w:val="32"/>
+                <w:szCs w:val="32"/>
+              </w:rPr>
+              <w:t>6</w:t>
             </w:r>
           </w:p>
         </w:tc>
@@ -292,7 +322,6 @@
         <w:rPr>
           <w:rFonts w:ascii="Arial" w:eastAsia="Arial" w:hAnsi="Arial" w:cs="Arial"/>
           <w:b/>
-          <w:u w:val="single"/>
         </w:rPr>
       </w:pPr>
       <w:r>
@@ -300,22 +329,13 @@
           <w:rFonts w:ascii="Arial" w:eastAsia="Arial" w:hAnsi="Arial" w:cs="Arial"/>
           <w:b/>
         </w:rPr>
-        <w:t xml:space="preserve"> </w:t>
-      </w:r>
-      <w:r>
-        <w:rPr>
-          <w:rFonts w:ascii="Arial" w:eastAsia="Arial" w:hAnsi="Arial" w:cs="Arial"/>
-          <w:b/>
-          <w:u w:val="single"/>
-        </w:rPr>
-        <w:t xml:space="preserve">Report on </w:t>
+        <w:t xml:space="preserve"> Report on </w:t>
       </w:r>
       <w:r>
         <w:rPr>
           <w:rFonts w:ascii="Arial" w:eastAsia="Arial" w:hAnsi="Arial" w:cs="Arial"/>
           <w:b/>
           <w:bCs/>
-          <w:u w:val="single"/>
         </w:rPr>
         <w:t>{activityTitle}</w:t>
       </w:r>
@@ -352,10 +372,11 @@
               <w:bottom w:val="single" w:sz="4" w:space="0" w:color="000000"/>
               <w:right w:val="single" w:sz="4" w:space="0" w:color="000000"/>
             </w:tcBorders>
+            <w:vAlign w:val="center"/>
           </w:tcPr>
           <w:p>
             <w:pPr>
-              <w:spacing w:after="280"/>
+              <w:spacing w:after="0"/>
               <w:jc w:val="center"/>
               <w:rPr>
                 <w:rFonts w:ascii="Arial" w:eastAsia="Arial" w:hAnsi="Arial" w:cs="Arial"/>
@@ -385,9 +406,11 @@
               <w:bottom w:val="single" w:sz="4" w:space="0" w:color="000000"/>
               <w:right w:val="single" w:sz="4" w:space="0" w:color="000000"/>
             </w:tcBorders>
+            <w:vAlign w:val="center"/>
           </w:tcPr>
           <w:p>
             <w:pPr>
+              <w:spacing w:after="0"/>
               <w:rPr>
                 <w:rFonts w:ascii="Arial" w:eastAsia="Arial" w:hAnsi="Arial" w:cs="Arial"/>
                 <w:b/>
@@ -411,9 +434,11 @@
               <w:bottom w:val="single" w:sz="4" w:space="0" w:color="000000"/>
               <w:right w:val="single" w:sz="4" w:space="0" w:color="000000"/>
             </w:tcBorders>
+            <w:vAlign w:val="center"/>
           </w:tcPr>
           <w:p>
             <w:pPr>
+              <w:spacing w:after="0"/>
               <w:rPr>
                 <w:rFonts w:ascii="Arial" w:eastAsia="Arial" w:hAnsi="Arial" w:cs="Arial"/>
               </w:rPr>
@@ -440,10 +465,11 @@
               <w:bottom w:val="single" w:sz="4" w:space="0" w:color="000000"/>
               <w:right w:val="single" w:sz="4" w:space="0" w:color="000000"/>
             </w:tcBorders>
+            <w:vAlign w:val="center"/>
           </w:tcPr>
           <w:p>
             <w:pPr>
-              <w:spacing w:after="240"/>
+              <w:spacing w:after="0"/>
               <w:rPr>
                 <w:rFonts w:ascii="Arial" w:eastAsia="Arial" w:hAnsi="Arial" w:cs="Arial"/>
                 <w:b/>
@@ -467,10 +493,11 @@
               <w:bottom w:val="single" w:sz="4" w:space="0" w:color="000000"/>
               <w:right w:val="single" w:sz="4" w:space="0" w:color="000000"/>
             </w:tcBorders>
+            <w:vAlign w:val="center"/>
           </w:tcPr>
           <w:p>
             <w:pPr>
-              <w:spacing w:after="240"/>
+              <w:spacing w:after="0"/>
               <w:rPr>
                 <w:rFonts w:ascii="Arial" w:eastAsia="Arial" w:hAnsi="Arial" w:cs="Arial"/>
               </w:rPr>
@@ -497,10 +524,11 @@
               <w:bottom w:val="single" w:sz="4" w:space="0" w:color="000000"/>
               <w:right w:val="single" w:sz="4" w:space="0" w:color="000000"/>
             </w:tcBorders>
+            <w:vAlign w:val="center"/>
           </w:tcPr>
           <w:p>
             <w:pPr>
-              <w:spacing w:after="240"/>
+              <w:spacing w:after="0"/>
               <w:rPr>
                 <w:rFonts w:ascii="Arial" w:eastAsia="Arial" w:hAnsi="Arial" w:cs="Arial"/>
                 <w:b/>
@@ -524,6 +552,7 @@
               <w:bottom w:val="single" w:sz="4" w:space="0" w:color="000000"/>
               <w:right w:val="single" w:sz="4" w:space="0" w:color="000000"/>
             </w:tcBorders>
+            <w:vAlign w:val="center"/>
           </w:tcPr>
           <w:p>
             <w:pPr>
@@ -534,7 +563,7 @@
                 <w:right w:val="nil"/>
                 <w:between w:val="nil"/>
               </w:pBdr>
-              <w:spacing w:after="240"/>
+              <w:spacing w:after="0"/>
               <w:rPr>
                 <w:rFonts w:ascii="Arial" w:eastAsia="Arial" w:hAnsi="Arial" w:cs="Arial"/>
               </w:rPr>
@@ -561,10 +590,11 @@
               <w:bottom w:val="single" w:sz="4" w:space="0" w:color="000000"/>
               <w:right w:val="single" w:sz="4" w:space="0" w:color="000000"/>
             </w:tcBorders>
+            <w:vAlign w:val="center"/>
           </w:tcPr>
           <w:p>
             <w:pPr>
-              <w:spacing w:after="240"/>
+              <w:spacing w:after="0"/>
               <w:rPr>
                 <w:rFonts w:ascii="Arial" w:eastAsia="Arial" w:hAnsi="Arial" w:cs="Arial"/>
                 <w:b/>
@@ -588,9 +618,11 @@
               <w:bottom w:val="single" w:sz="4" w:space="0" w:color="000000"/>
               <w:right w:val="single" w:sz="4" w:space="0" w:color="000000"/>
             </w:tcBorders>
+            <w:vAlign w:val="center"/>
           </w:tcPr>
           <w:p>
             <w:pPr>
+              <w:spacing w:after="0"/>
               <w:rPr>
                 <w:rFonts w:ascii="Arial" w:eastAsia="Arial" w:hAnsi="Arial" w:cs="Arial"/>
               </w:rPr>
@@ -617,10 +649,11 @@
               <w:bottom w:val="single" w:sz="4" w:space="0" w:color="000000"/>
               <w:right w:val="single" w:sz="4" w:space="0" w:color="000000"/>
             </w:tcBorders>
+            <w:vAlign w:val="center"/>
           </w:tcPr>
           <w:p>
             <w:pPr>
-              <w:spacing w:after="240"/>
+              <w:spacing w:after="0"/>
               <w:rPr>
                 <w:rFonts w:ascii="Arial" w:eastAsia="Arial" w:hAnsi="Arial" w:cs="Arial"/>
                 <w:b/>
@@ -644,10 +677,11 @@
               <w:bottom w:val="single" w:sz="4" w:space="0" w:color="000000"/>
               <w:right w:val="single" w:sz="4" w:space="0" w:color="000000"/>
             </w:tcBorders>
+            <w:vAlign w:val="center"/>
           </w:tcPr>
           <w:p>
             <w:pPr>
-              <w:spacing w:after="240"/>
+              <w:spacing w:after="0"/>
               <w:rPr>
                 <w:rFonts w:ascii="Arial" w:eastAsia="Arial" w:hAnsi="Arial" w:cs="Arial"/>
               </w:rPr>
@@ -674,9 +708,11 @@
               <w:bottom w:val="single" w:sz="4" w:space="0" w:color="000000"/>
               <w:right w:val="single" w:sz="4" w:space="0" w:color="000000"/>
             </w:tcBorders>
+            <w:vAlign w:val="center"/>
           </w:tcPr>
           <w:p>
             <w:pPr>
+              <w:spacing w:after="0"/>
               <w:rPr>
                 <w:rFonts w:ascii="Arial" w:eastAsia="Arial" w:hAnsi="Arial" w:cs="Arial"/>
                 <w:b/>
@@ -700,6 +736,7 @@
               <w:bottom w:val="single" w:sz="4" w:space="0" w:color="000000"/>
               <w:right w:val="single" w:sz="4" w:space="0" w:color="000000"/>
             </w:tcBorders>
+            <w:vAlign w:val="center"/>
           </w:tcPr>
           <w:p>
             <w:pPr>
@@ -710,6 +747,7 @@
                 <w:right w:val="nil"/>
                 <w:between w:val="nil"/>
               </w:pBdr>
+              <w:spacing w:after="0"/>
               <w:rPr>
                 <w:rFonts w:ascii="Arial" w:eastAsia="Arial" w:hAnsi="Arial" w:cs="Arial"/>
               </w:rPr>
@@ -736,10 +774,11 @@
               <w:bottom w:val="single" w:sz="4" w:space="0" w:color="000000"/>
               <w:right w:val="single" w:sz="4" w:space="0" w:color="000000"/>
             </w:tcBorders>
+            <w:vAlign w:val="center"/>
           </w:tcPr>
           <w:p>
             <w:pPr>
-              <w:spacing w:after="240"/>
+              <w:spacing w:after="0"/>
               <w:rPr>
                 <w:rFonts w:ascii="Arial" w:eastAsia="Arial" w:hAnsi="Arial" w:cs="Arial"/>
                 <w:b/>
@@ -763,6 +802,7 @@
               <w:bottom w:val="single" w:sz="4" w:space="0" w:color="000000"/>
               <w:right w:val="single" w:sz="4" w:space="0" w:color="000000"/>
             </w:tcBorders>
+            <w:vAlign w:val="center"/>
           </w:tcPr>
           <w:p>
             <w:pPr>
@@ -773,7 +813,7 @@
                 <w:right w:val="nil"/>
                 <w:between w:val="nil"/>
               </w:pBdr>
-              <w:spacing w:after="240"/>
+              <w:spacing w:after="0"/>
               <w:rPr>
                 <w:rFonts w:ascii="Arial" w:eastAsia="Arial" w:hAnsi="Arial" w:cs="Arial"/>
               </w:rPr>
@@ -800,10 +840,11 @@
               <w:bottom w:val="single" w:sz="4" w:space="0" w:color="000000"/>
               <w:right w:val="single" w:sz="4" w:space="0" w:color="000000"/>
             </w:tcBorders>
+            <w:vAlign w:val="center"/>
           </w:tcPr>
           <w:p>
             <w:pPr>
-              <w:spacing w:after="240"/>
+              <w:spacing w:after="0"/>
               <w:rPr>
                 <w:rFonts w:ascii="Arial" w:eastAsia="Arial" w:hAnsi="Arial" w:cs="Arial"/>
                 <w:b/>
@@ -827,6 +868,7 @@
               <w:bottom w:val="single" w:sz="4" w:space="0" w:color="000000"/>
               <w:right w:val="single" w:sz="4" w:space="0" w:color="000000"/>
             </w:tcBorders>
+            <w:vAlign w:val="center"/>
           </w:tcPr>
           <w:p>
             <w:pPr>
@@ -837,7 +879,7 @@
                 <w:right w:val="nil"/>
                 <w:between w:val="nil"/>
               </w:pBdr>
-              <w:spacing w:after="240"/>
+              <w:spacing w:after="0"/>
               <w:rPr>
                 <w:rFonts w:ascii="Arial" w:eastAsia="Arial" w:hAnsi="Arial" w:cs="Arial"/>
               </w:rPr>
@@ -907,7 +949,7 @@
                 <w:right w:val="nil"/>
                 <w:between w:val="nil"/>
               </w:pBdr>
-              <w:spacing w:before="120" w:after="120" w:line="276" w:lineRule="auto"/>
+              <w:spacing w:before="160" w:after="120" w:line="276" w:lineRule="auto"/>
               <w:rPr>
                 <w:rFonts w:ascii="Arial" w:eastAsia="Arial" w:hAnsi="Arial" w:cs="Arial"/>
                 <w:b/>
@@ -973,6 +1015,7 @@
           <w:p>
             <w:pPr>
               <w:spacing w:before="120" w:line="276" w:lineRule="auto"/>
+              <w:jc w:val="both"/>
               <w:rPr>
                 <w:rFonts w:ascii="Arial" w:eastAsia="Arial" w:hAnsi="Arial" w:cs="Arial"/>
                 <w:lang w:val="en-IN"/>
@@ -1056,6 +1099,7 @@
           <w:p>
             <w:pPr>
               <w:spacing w:before="120" w:line="276" w:lineRule="auto"/>
+              <w:jc w:val="both"/>
               <w:rPr>
                 <w:rFonts w:ascii="Arial" w:eastAsia="Arial" w:hAnsi="Arial" w:cs="Arial"/>
                 <w:lang w:val="en-IN"/>
@@ -1135,6 +1179,7 @@
           <w:p>
             <w:pPr>
               <w:spacing w:before="120" w:line="276" w:lineRule="auto"/>
+              <w:jc w:val="both"/>
               <w:rPr>
                 <w:rFonts w:ascii="Arial" w:eastAsia="Arial" w:hAnsi="Arial" w:cs="Arial"/>
                 <w:lang w:val="en-IN"/>
@@ -1164,37 +1209,14 @@
           </w:p>
         </w:tc>
       </w:tr>
-    </w:tbl>
-    <w:p/>
-    <w:tbl>
-      <w:tblPr>
-        <w:tblpPr w:leftFromText="180" w:rightFromText="180" w:bottomFromText="200" w:vertAnchor="text" w:tblpX="-431" w:tblpY="1"/>
-        <w:tblW w:w="10484" w:type="dxa"/>
-        <w:tblBorders>
-          <w:top w:val="single" w:sz="4" w:space="0" w:color="000000"/>
-          <w:left w:val="single" w:sz="4" w:space="0" w:color="000000"/>
-          <w:bottom w:val="single" w:sz="4" w:space="0" w:color="000000"/>
-          <w:right w:val="single" w:sz="4" w:space="0" w:color="000000"/>
-          <w:insideH w:val="single" w:sz="4" w:space="0" w:color="000000"/>
-          <w:insideV w:val="single" w:sz="4" w:space="0" w:color="000000"/>
-        </w:tblBorders>
-        <w:tblLayout w:type="fixed"/>
-        <w:tblCellMar>
-          <w:left w:w="115" w:type="dxa"/>
-          <w:right w:w="115" w:type="dxa"/>
-        </w:tblCellMar>
-        <w:tblLook w:val="0400" w:firstRow="0" w:lastRow="0" w:firstColumn="0" w:lastColumn="0" w:noHBand="0" w:noVBand="1"/>
-      </w:tblPr>
-      <w:tblGrid>
-        <w:gridCol w:w="10484"/>
-      </w:tblGrid>
       <w:tr>
         <w:trPr>
-          <w:trHeight w:hRule="exact" w:val="370"/>
+          <w:trHeight w:val="407"/>
         </w:trPr>
         <w:tc>
           <w:tcPr>
             <w:tcW w:w="10484" w:type="dxa"/>
+            <w:gridSpan w:val="2"/>
             <w:tcBorders>
               <w:top w:val="single" w:sz="4" w:space="0" w:color="000000"/>
               <w:left w:val="single" w:sz="4" w:space="0" w:color="000000"/>
@@ -1205,8 +1227,12 @@
           </w:tcPr>
           <w:p>
             <w:pPr>
-              <w:spacing w:after="0"/>
+              <w:spacing w:before="120" w:line="276" w:lineRule="auto"/>
               <w:jc w:val="center"/>
+              <w:rPr>
+                <w:rFonts w:ascii="Arial" w:eastAsia="Arial" w:hAnsi="Arial" w:cs="Arial"/>
+                <w:lang w:val="en-IN"/>
+              </w:rPr>
             </w:pPr>
             <w:r>
               <w:rPr>
@@ -1222,12 +1248,14 @@
         <w:tc>
           <w:tcPr>
             <w:tcW w:w="10484" w:type="dxa"/>
+            <w:gridSpan w:val="2"/>
             <w:tcBorders>
               <w:top w:val="single" w:sz="4" w:space="0" w:color="000000"/>
               <w:left w:val="single" w:sz="4" w:space="0" w:color="000000"/>
               <w:bottom w:val="single" w:sz="4" w:space="0" w:color="000000"/>
               <w:right w:val="single" w:sz="4" w:space="0" w:color="000000"/>
             </w:tcBorders>
+            <w:vAlign w:val="center"/>
           </w:tcPr>
           <w:p>
             <w:pPr>
@@ -1250,56 +1278,13 @@
                 <w:rFonts w:ascii="Arial" w:eastAsia="Arial" w:hAnsi="Arial" w:cs="Arial"/>
                 <w:lang w:val="en-IN"/>
               </w:rPr>
-              <w:t>{#photos}</w:t>
-            </w:r>
-          </w:p>
-          <w:p>
-            <w:pPr>
-              <w:pBdr>
-                <w:top w:val="nil"/>
-                <w:left w:val="nil"/>
-                <w:bottom w:val="nil"/>
-                <w:right w:val="nil"/>
-                <w:between w:val="nil"/>
-              </w:pBdr>
-              <w:spacing w:before="120" w:line="276" w:lineRule="auto"/>
-              <w:jc w:val="center"/>
-              <w:rPr>
-                <w:rFonts w:ascii="Arial" w:eastAsia="Arial" w:hAnsi="Arial" w:cs="Arial"/>
-                <w:lang w:val="en-IN"/>
-              </w:rPr>
-            </w:pPr>
-            <w:r>
-              <w:rPr>
-                <w:rFonts w:ascii="Arial" w:eastAsia="Arial" w:hAnsi="Arial" w:cs="Arial"/>
-                <w:lang w:val="en-IN"/>
-              </w:rPr>
-              <w:t>{%image}</w:t>
-            </w:r>
-          </w:p>
-          <w:p>
-            <w:pPr>
-              <w:pBdr>
-                <w:top w:val="nil"/>
-                <w:left w:val="nil"/>
-                <w:bottom w:val="nil"/>
-                <w:right w:val="nil"/>
-                <w:between w:val="nil"/>
-              </w:pBdr>
-              <w:spacing w:before="120" w:line="276" w:lineRule="auto"/>
-              <w:jc w:val="center"/>
-            </w:pPr>
-            <w:r>
-              <w:rPr>
-                <w:rFonts w:ascii="Arial" w:eastAsia="Arial" w:hAnsi="Arial" w:cs="Arial"/>
-                <w:lang w:val="en-IN"/>
-              </w:rPr>
-              <w:t>{/photos}</w:t>
+              <w:t>{#photos}{%image}{/photos}</w:t>
             </w:r>
           </w:p>
         </w:tc>
       </w:tr>
     </w:tbl>
+    <w:p/>
     <w:p>
       <w:pPr>
         <w:widowControl w:val="0"/>
@@ -2707,7 +2692,7 @@
   <w:style w:type="paragraph" w:default="1" w:styleId="Normal">
     <w:name w:val="Normal"/>
     <w:qFormat/>
-    <w:rsid w:val="00D96300"/>
+    <w:rsid w:val="00486B09"/>
     <w:rPr>
       <w:color w:val="000000"/>
       <w:lang w:eastAsia="zh-CN"/>
@@ -3326,6 +3311,23 @@
 </file>
 
 <file path=customXml/item1.xml><?xml version="1.0" encoding="utf-8"?>
+<p:properties xmlns:p="http://schemas.microsoft.com/office/2006/metadata/properties" xmlns:xsi="http://www.w3.org/2001/XMLSchema-instance" xmlns:pc="http://schemas.microsoft.com/office/infopath/2007/PartnerControls">
+  <documentManagement>
+    <_activity xmlns="b90a5dd7-aa71-4a85-8f48-13c6fa835524" xsi:nil="true"/>
+  </documentManagement>
+</p:properties>
+</file>
+
+<file path=customXml/item2.xml><?xml version="1.0" encoding="utf-8"?>
+<?mso-contentType ?>
+<FormTemplates xmlns="http://schemas.microsoft.com/sharepoint/v3/contenttype/forms">
+  <Display>DocumentLibraryForm</Display>
+  <Edit>DocumentLibraryForm</Edit>
+  <New>DocumentLibraryForm</New>
+</FormTemplates>
+</file>
+
+<file path=customXml/item3.xml><?xml version="1.0" encoding="utf-8"?>
 <ct:contentTypeSchema xmlns:ct="http://schemas.microsoft.com/office/2006/metadata/contentType" xmlns:ma="http://schemas.microsoft.com/office/2006/metadata/properties/metaAttributes" ct:_="" ma:_="" ma:contentTypeName="Document" ma:contentTypeID="0x0101004AB5B28D5E4A8843939702098EA1F738" ma:contentTypeVersion="15" ma:contentTypeDescription="Create a new document." ma:contentTypeScope="" ma:versionID="a74a2eb69422255f228d0b055386623c">
   <xsd:schema xmlns:xsd="http://www.w3.org/2001/XMLSchema" xmlns:xs="http://www.w3.org/2001/XMLSchema" xmlns:p="http://schemas.microsoft.com/office/2006/metadata/properties" xmlns:ns3="b90a5dd7-aa71-4a85-8f48-13c6fa835524" xmlns:ns4="18476398-8ca6-4946-94a6-ac9e400438d5" targetNamespace="http://schemas.microsoft.com/office/2006/metadata/properties" ma:root="true" ma:fieldsID="cbd4073dc0202f84877093169fa8f9f0" ns3:_="" ns4:_="">
     <xsd:import namespace="b90a5dd7-aa71-4a85-8f48-13c6fa835524"/>
@@ -3558,34 +3560,35 @@
 </ct:contentTypeSchema>
 </file>
 
-<file path=customXml/item2.xml><?xml version="1.0" encoding="utf-8"?>
+<file path=customXml/item4.xml><?xml version="1.0" encoding="utf-8"?>
 <go:gDocsCustomXmlDataStorage xmlns:go="http://customooxmlschemas.google.com/" xmlns:r="http://schemas.openxmlformats.org/officeDocument/2006/relationships" uri="GoogleDocsCustomDataVersion2">
   <go:docsCustomData xmlns:go="http://customooxmlschemas.google.com/" roundtripDataSignature="AMtx7mhho/nAe37LWwrl8/2HTW0NC/hKUw==">CgMxLjAyCGguZ2pkZ3hzOAByITFwb3lSSGlYNEs1dy1NSTlUWXdaZUwxNnFtSjJHQjRVRA==</go:docsCustomData>
 </go:gDocsCustomXmlDataStorage>
 </file>
 
-<file path=customXml/item3.xml><?xml version="1.0" encoding="utf-8"?>
+<file path=customXml/item5.xml><?xml version="1.0" encoding="utf-8"?>
 <b:Sources xmlns:b="http://schemas.openxmlformats.org/officeDocument/2006/bibliography" xmlns="http://schemas.openxmlformats.org/officeDocument/2006/bibliography" SelectedStyle="\APASixthEditionOfficeOnline.xsl" StyleName="APA" Version="6"/>
 </file>
 
-<file path=customXml/item4.xml><?xml version="1.0" encoding="utf-8"?>
-<p:properties xmlns:p="http://schemas.microsoft.com/office/2006/metadata/properties" xmlns:xsi="http://www.w3.org/2001/XMLSchema-instance" xmlns:pc="http://schemas.microsoft.com/office/infopath/2007/PartnerControls">
-  <documentManagement>
-    <_activity xmlns="b90a5dd7-aa71-4a85-8f48-13c6fa835524" xsi:nil="true"/>
-  </documentManagement>
-</p:properties>
+<file path=customXml/itemProps1.xml><?xml version="1.0" encoding="utf-8"?>
+<ds:datastoreItem xmlns:ds="http://schemas.openxmlformats.org/officeDocument/2006/customXml" ds:itemID="{219B6FFE-09C9-42D1-BDDC-5832733635F0}">
+  <ds:schemaRefs>
+    <ds:schemaRef ds:uri="http://schemas.microsoft.com/office/2006/metadata/properties"/>
+    <ds:schemaRef ds:uri="http://schemas.microsoft.com/office/infopath/2007/PartnerControls"/>
+    <ds:schemaRef ds:uri="b90a5dd7-aa71-4a85-8f48-13c6fa835524"/>
+  </ds:schemaRefs>
+</ds:datastoreItem>
 </file>
 
-<file path=customXml/item5.xml><?xml version="1.0" encoding="utf-8"?>
-<?mso-contentType ?>
-<FormTemplates xmlns="http://schemas.microsoft.com/sharepoint/v3/contenttype/forms">
-  <Display>DocumentLibraryForm</Display>
-  <Edit>DocumentLibraryForm</Edit>
-  <New>DocumentLibraryForm</New>
-</FormTemplates>
+<file path=customXml/itemProps2.xml><?xml version="1.0" encoding="utf-8"?>
+<ds:datastoreItem xmlns:ds="http://schemas.openxmlformats.org/officeDocument/2006/customXml" ds:itemID="{81E4BF22-E8C7-4C09-8BF8-BFA616310176}">
+  <ds:schemaRefs>
+    <ds:schemaRef ds:uri="http://schemas.microsoft.com/sharepoint/v3/contenttype/forms"/>
+  </ds:schemaRefs>
+</ds:datastoreItem>
 </file>
 
-<file path=customXml/itemProps1.xml><?xml version="1.0" encoding="utf-8"?>
+<file path=customXml/itemProps3.xml><?xml version="1.0" encoding="utf-8"?>
 <ds:datastoreItem xmlns:ds="http://schemas.openxmlformats.org/officeDocument/2006/customXml" ds:itemID="{458D1DC3-0744-42CA-BC54-7808595FD600}">
   <ds:schemaRefs>
     <ds:schemaRef ds:uri="http://schemas.microsoft.com/office/2006/metadata/contentType"/>
@@ -3604,7 +3607,7 @@
 </ds:datastoreItem>
 </file>
 
-<file path=customXml/itemProps2.xml><?xml version="1.0" encoding="utf-8"?>
+<file path=customXml/itemProps4.xml><?xml version="1.0" encoding="utf-8"?>
 <ds:datastoreItem xmlns:ds="http://schemas.openxmlformats.org/officeDocument/2006/customXml" ds:itemID="{11111111-1234-1234-1234-123412341234}">
   <ds:schemaRefs>
     <ds:schemaRef ds:uri="http://customooxmlschemas.google.com/"/>
@@ -3613,28 +3616,10 @@
 </ds:datastoreItem>
 </file>
 
-<file path=customXml/itemProps3.xml><?xml version="1.0" encoding="utf-8"?>
+<file path=customXml/itemProps5.xml><?xml version="1.0" encoding="utf-8"?>
 <ds:datastoreItem xmlns:ds="http://schemas.openxmlformats.org/officeDocument/2006/customXml" ds:itemID="{2D3D784A-26E4-43C8-B2BE-75C33B03B68D}">
   <ds:schemaRefs>
     <ds:schemaRef ds:uri="http://schemas.openxmlformats.org/officeDocument/2006/bibliography"/>
   </ds:schemaRefs>
 </ds:datastoreItem>
-</file>
-
-<file path=customXml/itemProps4.xml><?xml version="1.0" encoding="utf-8"?>
-<ds:datastoreItem xmlns:ds="http://schemas.openxmlformats.org/officeDocument/2006/customXml" ds:itemID="{219B6FFE-09C9-42D1-BDDC-5832733635F0}">
-  <ds:schemaRefs>
-    <ds:schemaRef ds:uri="http://schemas.microsoft.com/office/2006/metadata/properties"/>
-    <ds:schemaRef ds:uri="http://schemas.microsoft.com/office/infopath/2007/PartnerControls"/>
-    <ds:schemaRef ds:uri="b90a5dd7-aa71-4a85-8f48-13c6fa835524"/>
-  </ds:schemaRefs>
-</ds:datastoreItem>
-</file>
-
-<file path=customXml/itemProps5.xml><?xml version="1.0" encoding="utf-8"?>
-<ds:datastoreItem xmlns:ds="http://schemas.openxmlformats.org/officeDocument/2006/customXml" ds:itemID="{81E4BF22-E8C7-4C09-8BF8-BFA616310176}">
-  <ds:schemaRefs>
-    <ds:schemaRef ds:uri="http://schemas.microsoft.com/sharepoint/v3/contenttype/forms"/>
-  </ds:schemaRefs>
-</ds:datastoreItem>
 </file>
</xml_diff>